<commit_message>
Remove Russian language only from Ukrainian CV
</commit_message>
<xml_diff>
--- a/dist/assets/documents/Krystyna-Mishchenko-CV-UK.docx
+++ b/dist/assets/documents/Krystyna-Mishchenko-CV-UK.docx
@@ -420,7 +420,7 @@
               <w:jc w:val="left"/>
             </w:pPr>
             <w:r>
-              <w:t>Російська — рівень носія</w:t>
+              <w:t>Німецька — B1, підтверджено сертифікатом</w:t>
             </w:r>
           </w:p>
         </w:tc>
@@ -435,7 +435,7 @@
               <w:jc w:val="left"/>
             </w:pPr>
             <w:r>
-              <w:t>Німецька — B1, підтверджено сертифікатом</w:t>
+              <w:t>Польська — комунікативна</w:t>
             </w:r>
           </w:p>
         </w:tc>
@@ -448,30 +448,9 @@
               <w:jc w:val="left"/>
             </w:pPr>
             <w:r>
-              <w:t>Польська — комунікативна</w:t>
-            </w:r>
-          </w:p>
-        </w:tc>
-      </w:tr>
-      <w:tr>
-        <w:tc>
-          <w:tcPr>
-            <w:tcW w:type="dxa" w:w="4933"/>
-          </w:tcPr>
-          <w:p>
-            <w:pPr>
-              <w:jc w:val="left"/>
-            </w:pPr>
-            <w:r>
               <w:t>Англійська — початковий рівень.</w:t>
             </w:r>
           </w:p>
-        </w:tc>
-        <w:tc>
-          <w:tcPr>
-            <w:tcW w:type="dxa" w:w="4933"/>
-          </w:tcPr>
-          <w:p/>
         </w:tc>
       </w:tr>
     </w:tbl>

</xml_diff>